<commit_message>
Sync all docs to v1.1 — remove Arrange refs, add v1.1 features
README.md:
- Remove "group, z-order" from direct manipulation row.
- Add multi-select format and system paste feature rows.
- Update export row to mention <original-name>-editado.html.
- Minor: "rearrange" → "edit" in quick start step 4.

Manual_ALETHEIA_User_V1_EN.docx:
- Version bump: 1.0 → 1.1.
- §4.2.3 NOTE: Arrange functions fully removed in v1.1 (was
  incorrectly pointing to keyboard shortcuts that no longer exist).
- §9: New TIP explaining multi-select format behaviour.
- §10.1: Download paragraph updated with filename pattern.
- §10.2: New TIP about OS clipboard paste (image → object,
  plain text → textbox).
- §11 shortcuts table: removed "Group ↔ Ungroup (Shift+G)" and
  "Bring forward / send backward (Shift+]/[)" rows.

Co-Authored-By: Claude Sonnet 4.6 <noreply@anthropic.com>
</commit_message>
<xml_diff>
--- a/docs/Manual_ALETHEIA_User_V1_EN.docx
+++ b/docs/Manual_ALETHEIA_User_V1_EN.docx
@@ -61,7 +61,7 @@
           <w:color w:val="666D6E"/>
           <w:sz w:val="20"/>
         </w:rPr>
-        <w:t>Version 1.0  —  June 2026</w:t>
+        <w:t>Version 1.1  —  June 2026</w:t>
       </w:r>
     </w:p>
     <w:p>
@@ -1513,7 +1513,7 @@
           <w:color w:val="333333"/>
           <w:sz w:val="20"/>
         </w:rPr>
-        <w:t>The old Align, Distribute and Order/Group buttons were removed from the ribbon. Grouping and z-order are still available from the keyboard (see Keyboard Shortcuts).</w:t>
+        <w:t>The Align, Distribute, Group and Z-Order functions have been removed in v1.1.</w:t>
       </w:r>
     </w:p>
     <w:p>
@@ -2258,6 +2258,30 @@
     </w:p>
     <w:p>
       <w:pPr>
+        <w:spacing w:before="80" w:after="160"/>
+        <w:ind w:left="160" w:right="160"/>
+        <w:shd w:val="clear" w:fill="F1EFE8"/>
+      </w:pPr>
+      <w:r>
+        <w:rPr>
+          <w:rFonts w:ascii="Helvetica Neue" w:hAnsi="Helvetica Neue"/>
+          <w:b/>
+          <w:color w:val="0A0A0A"/>
+          <w:sz w:val="19"/>
+        </w:rPr>
+        <w:t xml:space="preserve">TIP  </w:t>
+      </w:r>
+      <w:r>
+        <w:rPr>
+          <w:rFonts w:ascii="Helvetica Neue" w:hAnsi="Helvetica Neue"/>
+          <w:color w:val="333333"/>
+          <w:sz w:val="20"/>
+        </w:rPr>
+        <w:t>When multiple elements are selected — by marquee or Ctrl/⌘+click — every Format action (font, colour, bold, align, rotate…) applies to all of them at once.</w:t>
+      </w:r>
+    </w:p>
+    <w:p>
+      <w:pPr>
         <w:pStyle w:val="Heading2"/>
       </w:pPr>
       <w:r>
@@ -2846,7 +2870,7 @@
           <w:color w:val="0A0A0A"/>
           <w:sz w:val="21"/>
         </w:rPr>
-        <w:t>The browser saves an HTML file in your Downloads folder containing every change, including your annotations and Reflection notes.</w:t>
+        <w:t xml:space="preserve">The browser saves a file named ‘original-filename-editado.html’ in your Downloads folder, containing every change — annotations, notes and all edits.</w:t>
       </w:r>
     </w:p>
     <w:p>
@@ -2855,6 +2879,30 @@
       </w:pPr>
       <w:r>
         <w:t>10.2. Undo and redo</w:t>
+      </w:r>
+    </w:p>
+    <w:p>
+      <w:pPr>
+        <w:spacing w:before="80" w:after="160"/>
+        <w:ind w:left="160" w:right="160"/>
+        <w:shd w:val="clear" w:fill="F1EFE8"/>
+      </w:pPr>
+      <w:r>
+        <w:rPr>
+          <w:rFonts w:ascii="Helvetica Neue" w:hAnsi="Helvetica Neue"/>
+          <w:b/>
+          <w:color w:val="0A0A0A"/>
+          <w:sz w:val="19"/>
+        </w:rPr>
+        <w:t xml:space="preserve">TIP  </w:t>
+      </w:r>
+      <w:r>
+        <w:rPr>
+          <w:rFonts w:ascii="Helvetica Neue" w:hAnsi="Helvetica Neue"/>
+          <w:color w:val="333333"/>
+          <w:sz w:val="20"/>
+        </w:rPr>
+        <w:t>Ctrl/⌘+V also accepts content from the OS clipboard: paste an image directly onto the canvas (it becomes an image object) or paste plain text (it becomes a new text box).</w:t>
       </w:r>
     </w:p>
     <w:p>
@@ -3233,86 +3281,6 @@
                 <w:sz w:val="19"/>
               </w:rPr>
               <w:t>Arrow keys / Shift + Arrows</w:t>
-            </w:r>
-          </w:p>
-        </w:tc>
-      </w:tr>
-      <w:tr>
-        <w:tc>
-          <w:tcPr>
-            <w:tcW w:type="dxa" w:w="4309"/>
-          </w:tcPr>
-          <w:p>
-            <w:pPr>
-              <w:spacing w:after="40"/>
-            </w:pPr>
-            <w:r/>
-            <w:r>
-              <w:rPr>
-                <w:rFonts w:ascii="Helvetica Neue" w:hAnsi="Helvetica Neue"/>
-                <w:color w:val="0A0A0A"/>
-                <w:sz w:val="19"/>
-              </w:rPr>
-              <w:t>Group ↔ Ungroup</w:t>
-            </w:r>
-          </w:p>
-        </w:tc>
-        <w:tc>
-          <w:tcPr>
-            <w:tcW w:type="dxa" w:w="4535"/>
-          </w:tcPr>
-          <w:p>
-            <w:pPr>
-              <w:spacing w:after="40"/>
-            </w:pPr>
-            <w:r/>
-            <w:r>
-              <w:rPr>
-                <w:rFonts w:ascii="Helvetica Neue" w:hAnsi="Helvetica Neue"/>
-                <w:color w:val="0A0A0A"/>
-                <w:sz w:val="19"/>
-              </w:rPr>
-              <w:t>Shift + G</w:t>
-            </w:r>
-          </w:p>
-        </w:tc>
-      </w:tr>
-      <w:tr>
-        <w:tc>
-          <w:tcPr>
-            <w:tcW w:type="dxa" w:w="4309"/>
-          </w:tcPr>
-          <w:p>
-            <w:pPr>
-              <w:spacing w:after="40"/>
-            </w:pPr>
-            <w:r/>
-            <w:r>
-              <w:rPr>
-                <w:rFonts w:ascii="Helvetica Neue" w:hAnsi="Helvetica Neue"/>
-                <w:color w:val="0A0A0A"/>
-                <w:sz w:val="19"/>
-              </w:rPr>
-              <w:t>Bring forward / send backward</w:t>
-            </w:r>
-          </w:p>
-        </w:tc>
-        <w:tc>
-          <w:tcPr>
-            <w:tcW w:type="dxa" w:w="4535"/>
-          </w:tcPr>
-          <w:p>
-            <w:pPr>
-              <w:spacing w:after="40"/>
-            </w:pPr>
-            <w:r/>
-            <w:r>
-              <w:rPr>
-                <w:rFonts w:ascii="Helvetica Neue" w:hAnsi="Helvetica Neue"/>
-                <w:color w:val="0A0A0A"/>
-                <w:sz w:val="19"/>
-              </w:rPr>
-              <w:t>Shift + ]  /  Shift + [</w:t>
             </w:r>
           </w:p>
         </w:tc>

</xml_diff>